<commit_message>
additional train & COCO
</commit_message>
<xml_diff>
--- a/텀프로젝트결과보고서_초안.docx
+++ b/텀프로젝트결과보고서_초안.docx
@@ -1103,21 +1103,81 @@
       <w:pPr>
         <w:spacing w:before="240" w:after="240"/>
         <w:ind w:firstLineChars="100" w:firstLine="200"/>
-        <w:jc w:val="left"/>
-        <w:rPr>
-          <w:rFonts w:ascii="바탕" w:eastAsia="바탕" w:hAnsi="바탕"/>
-        </w:rPr>
-      </w:pPr>
-      <w:r>
-        <w:rPr>
-          <w:rFonts w:ascii="바탕" w:eastAsia="바탕" w:hAnsi="바탕"/>
-        </w:rPr>
-        <w:t>또한 어린이 보호구역의 노란색 횡단보도는 일반 횡단보도와 색상 및 외형 특성이 달라 기존 모델의 검출 성능 저하가 예상되었다. 이를 보완하기 위해 추가 데이터를 수집하고 Horizontal Flip, Rotation(±15°), Brightness(±15%), Exposure(±10%) 기반 데이터 증강을 수행하여 총 558장의 학습 데이터를 구축하였다. 이후 해당 데이터를 이용해 횡단보도 검출 모델을 Fine-tuning함으로써 다양한 횡단보도 환경에 대한 적응성을 향상시켰다.</w:t>
+        <w:rPr>
+          <w:rFonts w:ascii="바탕" w:eastAsia="바탕" w:hAnsi="바탕"/>
+        </w:rPr>
+      </w:pPr>
+      <w:r>
+        <w:rPr>
+          <w:rFonts w:ascii="바탕" w:eastAsia="바탕" w:hAnsi="바탕"/>
+        </w:rPr>
+        <w:t>또한 어린이 보호구역의 노란색 횡단보도는 일반 횡단보도와 색상 및 외형 특성이 달라 기존 모델의 검출 성능 저하가 예상되었다. 이를 보완하기 위해 추가 데이터를 수집하고 Horizontal</w:t>
+      </w:r>
+      <w:r>
+        <w:rPr>
+          <w:rFonts w:ascii="바탕" w:eastAsia="바탕" w:hAnsi="바탕" w:hint="eastAsia"/>
+        </w:rPr>
+        <w:t xml:space="preserve"> </w:t>
+      </w:r>
+      <w:r>
+        <w:rPr>
+          <w:rFonts w:ascii="바탕" w:eastAsia="바탕" w:hAnsi="바탕"/>
+        </w:rPr>
+        <w:t>Flip,</w:t>
+      </w:r>
+      <w:r>
+        <w:rPr>
+          <w:rFonts w:ascii="바탕" w:eastAsia="바탕" w:hAnsi="바탕" w:hint="eastAsia"/>
+        </w:rPr>
+        <w:t xml:space="preserve"> </w:t>
+      </w:r>
+      <w:r>
+        <w:rPr>
+          <w:rFonts w:ascii="바탕" w:eastAsia="바탕" w:hAnsi="바탕"/>
+        </w:rPr>
+        <w:t>Rotation</w:t>
+      </w:r>
+      <w:r>
+        <w:rPr>
+          <w:rFonts w:ascii="바탕" w:eastAsia="바탕" w:hAnsi="바탕" w:hint="eastAsia"/>
+        </w:rPr>
+        <w:t xml:space="preserve"> </w:t>
+      </w:r>
+      <w:r>
+        <w:rPr>
+          <w:rFonts w:ascii="바탕" w:eastAsia="바탕" w:hAnsi="바탕"/>
+        </w:rPr>
+        <w:t>(±15°),</w:t>
+      </w:r>
+      <w:r>
+        <w:rPr>
+          <w:rFonts w:ascii="바탕" w:eastAsia="바탕" w:hAnsi="바탕" w:hint="eastAsia"/>
+        </w:rPr>
+        <w:t xml:space="preserve"> </w:t>
+      </w:r>
+      <w:r>
+        <w:rPr>
+          <w:rFonts w:ascii="바탕" w:eastAsia="바탕" w:hAnsi="바탕"/>
+        </w:rPr>
+        <w:t>Brightness(±15%),</w:t>
+      </w:r>
+      <w:r>
+        <w:rPr>
+          <w:rFonts w:ascii="바탕" w:eastAsia="바탕" w:hAnsi="바탕" w:hint="eastAsia"/>
+        </w:rPr>
+        <w:t xml:space="preserve"> </w:t>
+      </w:r>
+      <w:r>
+        <w:rPr>
+          <w:rFonts w:ascii="바탕" w:eastAsia="바탕" w:hAnsi="바탕"/>
+        </w:rPr>
+        <w:t>Exposure(±10%) 기반 데이터 증강을 수행하였다. 초기 학습에는 총 558장의 데이터를 사용하였으며, 검출 성능 향상을 위해 추가 증강 데이터를 생성하여 총 1,814장 규모의 데이터셋으로 Fine-tuning을 진행하였다.</w:t>
       </w:r>
     </w:p>
     <w:p>
       <w:pPr>
         <w:spacing w:before="240" w:after="240"/>
+        <w:ind w:firstLineChars="100" w:firstLine="220"/>
         <w:rPr>
           <w:rFonts w:eastAsia="돋움"/>
           <w:b/>
@@ -1353,161 +1413,266 @@
         <w:rPr>
           <w:rFonts w:ascii="바탕" w:eastAsia="바탕" w:hAnsi="바탕" w:hint="eastAsia"/>
         </w:rPr>
+        <w:t xml:space="preserve">YOLOv5는 OpenCV 및 </w:t>
+      </w:r>
+      <w:proofErr w:type="spellStart"/>
+      <w:r>
+        <w:rPr>
+          <w:rFonts w:ascii="바탕" w:eastAsia="바탕" w:hAnsi="바탕" w:hint="eastAsia"/>
+        </w:rPr>
+        <w:t>PyTorch</w:t>
+      </w:r>
+      <w:proofErr w:type="spellEnd"/>
+      <w:r>
+        <w:rPr>
+          <w:rFonts w:ascii="바탕" w:eastAsia="바탕" w:hAnsi="바탕" w:hint="eastAsia"/>
+        </w:rPr>
+        <w:t>기반 라</w:t>
+      </w:r>
+      <w:r>
+        <w:rPr>
+          <w:rFonts w:ascii="바탕" w:eastAsia="바탕" w:hAnsi="바탕" w:hint="eastAsia"/>
+        </w:rPr>
         <w:lastRenderedPageBreak/>
-        <w:t xml:space="preserve">YOLOv5는 OpenCV 및 </w:t>
+        <w:t xml:space="preserve">이브러리와의 호환성이 우수하며 </w:t>
+      </w:r>
+      <w:r>
+        <w:rPr>
+          <w:rFonts w:ascii="바탕" w:eastAsia="바탕" w:hAnsi="바탕" w:hint="eastAsia"/>
+        </w:rPr>
+        <w:t>시스템 통합이 용이하다. 본 프로젝트에서는 두 개의 객체 탐지 모델을 동시에 실행하고 탐지 결과를 종합하여 보행 가능 여부를 판단하는 구조를 구현하였으며, YOLOv5는 이러한 환경 구축에 적합하였다.</w:t>
+      </w:r>
+    </w:p>
+    <w:p>
+      <w:pPr>
+        <w:ind w:leftChars="100" w:left="400" w:hangingChars="100" w:hanging="200"/>
+        <w:rPr>
+          <w:rFonts w:ascii="바탕" w:eastAsia="바탕" w:hAnsi="바탕"/>
+        </w:rPr>
+      </w:pPr>
+      <w:r>
+        <w:rPr>
+          <w:rFonts w:ascii="바탕" w:eastAsia="바탕" w:hAnsi="바탕" w:hint="eastAsia"/>
+        </w:rPr>
+        <w:t>따라서</w:t>
+      </w:r>
+      <w:r>
+        <w:rPr>
+          <w:rFonts w:ascii="바탕" w:eastAsia="바탕" w:hAnsi="바탕" w:hint="eastAsia"/>
+        </w:rPr>
+        <w:t xml:space="preserve"> 본 프로젝트의 핵심 목표는 실제 교통 환경문제에 대한 성능 개선 및 적용이므로, 안정성과 </w:t>
+      </w:r>
+      <w:r>
+        <w:rPr>
+          <w:rFonts w:ascii="바탕" w:eastAsia="바탕" w:hAnsi="바탕" w:hint="eastAsia"/>
+        </w:rPr>
+        <w:t>실시간</w:t>
+      </w:r>
+      <w:r>
+        <w:rPr>
+          <w:rFonts w:ascii="바탕" w:eastAsia="바탕" w:hAnsi="바탕" w:hint="eastAsia"/>
+        </w:rPr>
+        <w:t>성을 고려하여 YOLOv5 모델을 선택</w:t>
+      </w:r>
+      <w:r>
+        <w:rPr>
+          <w:rFonts w:ascii="바탕" w:eastAsia="바탕" w:hAnsi="바탕" w:hint="eastAsia"/>
+        </w:rPr>
+        <w:t>하였다</w:t>
+      </w:r>
+      <w:r>
+        <w:rPr>
+          <w:rFonts w:ascii="바탕" w:eastAsia="바탕" w:hAnsi="바탕" w:hint="eastAsia"/>
+        </w:rPr>
+        <w:t xml:space="preserve">. </w:t>
+      </w:r>
+    </w:p>
+    <w:p>
+      <w:pPr>
+        <w:ind w:leftChars="100" w:left="400" w:hangingChars="100" w:hanging="200"/>
+        <w:rPr>
+          <w:rFonts w:ascii="바탕" w:eastAsia="바탕" w:hAnsi="바탕"/>
+        </w:rPr>
+      </w:pPr>
+      <w:r>
+        <w:rPr>
+          <w:rFonts w:ascii="바탕" w:eastAsia="바탕" w:hAnsi="바탕" w:hint="eastAsia"/>
+        </w:rPr>
+        <w:t>YOLOv5는 입력 영상에 대해 bounding box와 confidence score를 계산하고 NMS을 통해 중복된 객체 영역을 제거한다.</w:t>
+      </w:r>
+      <w:r>
+        <w:rPr>
+          <w:rFonts w:ascii="바탕" w:eastAsia="바탕" w:hAnsi="바탕" w:hint="eastAsia"/>
+        </w:rPr>
+        <w:t xml:space="preserve"> 기본적인 내용은 교재 </w:t>
+      </w:r>
+      <w:r>
+        <w:rPr>
+          <w:rFonts w:ascii="바탕" w:eastAsia="바탕" w:hAnsi="바탕" w:hint="eastAsia"/>
+        </w:rPr>
+        <w:t>9</w:t>
+      </w:r>
+      <w:r>
+        <w:rPr>
+          <w:rFonts w:ascii="바탕" w:eastAsia="바탕" w:hAnsi="바탕" w:hint="eastAsia"/>
+        </w:rPr>
+        <w:t>장에서 학습하였으며,</w:t>
+      </w:r>
+      <w:r>
+        <w:rPr>
+          <w:rFonts w:ascii="바탕" w:eastAsia="바탕" w:hAnsi="바탕"/>
+        </w:rPr>
+        <w:t xml:space="preserve"> </w:t>
+      </w:r>
+      <w:r>
+        <w:rPr>
+          <w:rFonts w:ascii="바탕" w:eastAsia="바탕" w:hAnsi="바탕" w:hint="eastAsia"/>
+          <w:color w:val="C45911" w:themeColor="accent2" w:themeShade="BF"/>
+        </w:rPr>
+        <w:t xml:space="preserve">좀 더 발전된 방법과 구현은 참고 문헌 </w:t>
+      </w:r>
+      <w:r>
+        <w:rPr>
+          <w:rFonts w:ascii="바탕" w:eastAsia="바탕" w:hAnsi="바탕"/>
+          <w:color w:val="C45911" w:themeColor="accent2" w:themeShade="BF"/>
+        </w:rPr>
+        <w:t>[1]</w:t>
+      </w:r>
+      <w:r>
+        <w:rPr>
+          <w:rFonts w:ascii="바탕" w:eastAsia="바탕" w:hAnsi="바탕" w:hint="eastAsia"/>
+          <w:color w:val="C45911" w:themeColor="accent2" w:themeShade="BF"/>
+        </w:rPr>
+        <w:t>에 나와 있다.</w:t>
+      </w:r>
+      <w:r>
+        <w:rPr>
+          <w:rFonts w:ascii="바탕" w:eastAsia="바탕" w:hAnsi="바탕"/>
+          <w:color w:val="C45911" w:themeColor="accent2" w:themeShade="BF"/>
+        </w:rPr>
+        <w:t xml:space="preserve"> </w:t>
+      </w:r>
+    </w:p>
+    <w:p>
+      <w:pPr>
+        <w:spacing w:before="240" w:after="240"/>
+        <w:rPr>
+          <w:rFonts w:eastAsia="돋움"/>
+          <w:b/>
+          <w:sz w:val="22"/>
+        </w:rPr>
+      </w:pPr>
+      <w:proofErr w:type="gramStart"/>
+      <w:r>
+        <w:rPr>
+          <w:rFonts w:eastAsia="돋움"/>
+          <w:b/>
+          <w:sz w:val="22"/>
+        </w:rPr>
+        <w:t xml:space="preserve">2.2 </w:t>
+      </w:r>
+      <w:r>
+        <w:rPr>
+          <w:rFonts w:eastAsia="돋움"/>
+          <w:b/>
+          <w:sz w:val="22"/>
+        </w:rPr>
+        <w:t xml:space="preserve"> </w:t>
+      </w:r>
+      <w:r>
+        <w:rPr>
+          <w:rFonts w:eastAsia="돋움" w:hint="eastAsia"/>
+          <w:b/>
+          <w:sz w:val="22"/>
+        </w:rPr>
+        <w:t>노란색</w:t>
+      </w:r>
+      <w:proofErr w:type="gramEnd"/>
+      <w:r>
+        <w:rPr>
+          <w:rFonts w:eastAsia="돋움" w:hint="eastAsia"/>
+          <w:b/>
+          <w:sz w:val="22"/>
+        </w:rPr>
+        <w:t xml:space="preserve"> </w:t>
+      </w:r>
+      <w:r>
+        <w:rPr>
+          <w:rFonts w:eastAsia="돋움" w:hint="eastAsia"/>
+          <w:b/>
+          <w:sz w:val="22"/>
+        </w:rPr>
+        <w:t>횡단보도</w:t>
+      </w:r>
+      <w:r>
+        <w:rPr>
+          <w:rFonts w:eastAsia="돋움" w:hint="eastAsia"/>
+          <w:b/>
+          <w:sz w:val="22"/>
+        </w:rPr>
+        <w:t xml:space="preserve"> </w:t>
+      </w:r>
+      <w:r>
+        <w:rPr>
+          <w:rFonts w:eastAsia="돋움" w:hint="eastAsia"/>
+          <w:b/>
+          <w:sz w:val="22"/>
+        </w:rPr>
+        <w:t>검출을</w:t>
+      </w:r>
+      <w:r>
+        <w:rPr>
+          <w:rFonts w:eastAsia="돋움" w:hint="eastAsia"/>
+          <w:b/>
+          <w:sz w:val="22"/>
+        </w:rPr>
+        <w:t xml:space="preserve"> </w:t>
+      </w:r>
+      <w:r>
+        <w:rPr>
+          <w:rFonts w:eastAsia="돋움" w:hint="eastAsia"/>
+          <w:b/>
+          <w:sz w:val="22"/>
+        </w:rPr>
+        <w:t>위한</w:t>
+      </w:r>
+      <w:r>
+        <w:rPr>
+          <w:rFonts w:eastAsia="돋움" w:hint="eastAsia"/>
+          <w:b/>
+          <w:sz w:val="22"/>
+        </w:rPr>
+        <w:t xml:space="preserve"> </w:t>
       </w:r>
       <w:proofErr w:type="spellStart"/>
       <w:r>
         <w:rPr>
-          <w:rFonts w:ascii="바탕" w:eastAsia="바탕" w:hAnsi="바탕" w:hint="eastAsia"/>
-        </w:rPr>
-        <w:t>PyTorch</w:t>
+          <w:rFonts w:eastAsia="돋움" w:hint="eastAsia"/>
+          <w:b/>
+          <w:sz w:val="22"/>
+        </w:rPr>
+        <w:t>전처리</w:t>
       </w:r>
       <w:proofErr w:type="spellEnd"/>
       <w:r>
         <w:rPr>
-          <w:rFonts w:ascii="바탕" w:eastAsia="바탕" w:hAnsi="바탕" w:hint="eastAsia"/>
-        </w:rPr>
-        <w:t xml:space="preserve">기반 라이브러리와의 호환성이 우수하며 </w:t>
-      </w:r>
-      <w:r>
-        <w:rPr>
-          <w:rFonts w:ascii="바탕" w:eastAsia="바탕" w:hAnsi="바탕" w:hint="eastAsia"/>
-        </w:rPr>
-        <w:t>시스템 통합이 용이하다. 본 프로젝트에서는 두 개의 객체 탐지 모델을 동시에 실행하고 탐지 결과를 종합하여 보행 가능 여부를 판단하는 구조를 구현하였으며, YOLOv5는 이러한 환경 구축에 적합하였다.</w:t>
-      </w:r>
-    </w:p>
-    <w:p>
-      <w:pPr>
-        <w:ind w:leftChars="100" w:left="400" w:hangingChars="100" w:hanging="200"/>
-        <w:rPr>
-          <w:rFonts w:ascii="바탕" w:eastAsia="바탕" w:hAnsi="바탕"/>
-        </w:rPr>
-      </w:pPr>
-      <w:r>
-        <w:rPr>
-          <w:rFonts w:ascii="바탕" w:eastAsia="바탕" w:hAnsi="바탕" w:hint="eastAsia"/>
-        </w:rPr>
-        <w:t>따라서</w:t>
-      </w:r>
-      <w:r>
-        <w:rPr>
-          <w:rFonts w:ascii="바탕" w:eastAsia="바탕" w:hAnsi="바탕" w:hint="eastAsia"/>
-        </w:rPr>
-        <w:t xml:space="preserve"> 본 프로젝트의 핵심 목표는 실제 교통 환경문제에 대한 성능 개선 및 적용이므로, 안정성과 </w:t>
-      </w:r>
-      <w:r>
-        <w:rPr>
-          <w:rFonts w:ascii="바탕" w:eastAsia="바탕" w:hAnsi="바탕" w:hint="eastAsia"/>
-        </w:rPr>
-        <w:t>실시간</w:t>
-      </w:r>
-      <w:r>
-        <w:rPr>
-          <w:rFonts w:ascii="바탕" w:eastAsia="바탕" w:hAnsi="바탕" w:hint="eastAsia"/>
-        </w:rPr>
-        <w:t>성을 고려하여 YOLOv5 모델을 선택</w:t>
-      </w:r>
-      <w:r>
-        <w:rPr>
-          <w:rFonts w:ascii="바탕" w:eastAsia="바탕" w:hAnsi="바탕" w:hint="eastAsia"/>
-        </w:rPr>
-        <w:t>하였다</w:t>
-      </w:r>
-      <w:r>
-        <w:rPr>
-          <w:rFonts w:ascii="바탕" w:eastAsia="바탕" w:hAnsi="바탕" w:hint="eastAsia"/>
-        </w:rPr>
-        <w:t xml:space="preserve">. </w:t>
-      </w:r>
-    </w:p>
-    <w:p>
-      <w:pPr>
-        <w:ind w:leftChars="100" w:left="400" w:hangingChars="100" w:hanging="200"/>
-        <w:rPr>
-          <w:rFonts w:ascii="바탕" w:eastAsia="바탕" w:hAnsi="바탕"/>
-        </w:rPr>
-      </w:pPr>
-      <w:r>
-        <w:rPr>
-          <w:rFonts w:ascii="바탕" w:eastAsia="바탕" w:hAnsi="바탕" w:hint="eastAsia"/>
-        </w:rPr>
-        <w:t>YOLOv5는 입력 영상에 대해 bounding box와 confidence score를 계산하고 NMS을 통해 중복된 객체 영역을 제거한다.</w:t>
-      </w:r>
-      <w:r>
-        <w:rPr>
-          <w:rFonts w:ascii="바탕" w:eastAsia="바탕" w:hAnsi="바탕" w:hint="eastAsia"/>
-        </w:rPr>
-        <w:t xml:space="preserve"> 기본적인 내용은 교재 </w:t>
-      </w:r>
-      <w:r>
-        <w:rPr>
-          <w:rFonts w:ascii="바탕" w:eastAsia="바탕" w:hAnsi="바탕" w:hint="eastAsia"/>
-        </w:rPr>
-        <w:t>9</w:t>
-      </w:r>
-      <w:r>
-        <w:rPr>
-          <w:rFonts w:ascii="바탕" w:eastAsia="바탕" w:hAnsi="바탕" w:hint="eastAsia"/>
-        </w:rPr>
-        <w:t>장에서 학습하였으며,</w:t>
-      </w:r>
-      <w:r>
-        <w:rPr>
-          <w:rFonts w:ascii="바탕" w:eastAsia="바탕" w:hAnsi="바탕"/>
-        </w:rPr>
-        <w:t xml:space="preserve"> </w:t>
-      </w:r>
-      <w:r>
-        <w:rPr>
-          <w:rFonts w:ascii="바탕" w:eastAsia="바탕" w:hAnsi="바탕" w:hint="eastAsia"/>
-          <w:color w:val="C45911" w:themeColor="accent2" w:themeShade="BF"/>
-        </w:rPr>
-        <w:t xml:space="preserve">좀 더 발전된 방법과 구현은 참고 문헌 </w:t>
-      </w:r>
-      <w:r>
-        <w:rPr>
-          <w:rFonts w:ascii="바탕" w:eastAsia="바탕" w:hAnsi="바탕"/>
-          <w:color w:val="C45911" w:themeColor="accent2" w:themeShade="BF"/>
-        </w:rPr>
-        <w:t>[1]</w:t>
-      </w:r>
-      <w:r>
-        <w:rPr>
-          <w:rFonts w:ascii="바탕" w:eastAsia="바탕" w:hAnsi="바탕" w:hint="eastAsia"/>
-          <w:color w:val="C45911" w:themeColor="accent2" w:themeShade="BF"/>
-        </w:rPr>
-        <w:t>에 나와 있다.</w:t>
-      </w:r>
-      <w:r>
-        <w:rPr>
-          <w:rFonts w:ascii="바탕" w:eastAsia="바탕" w:hAnsi="바탕"/>
-          <w:color w:val="C45911" w:themeColor="accent2" w:themeShade="BF"/>
-        </w:rPr>
-        <w:t xml:space="preserve"> </w:t>
-      </w:r>
-    </w:p>
-    <w:p>
-      <w:pPr>
-        <w:spacing w:before="240" w:after="240"/>
-        <w:rPr>
-          <w:rFonts w:eastAsia="돋움"/>
+          <w:rFonts w:eastAsia="돋움" w:hint="eastAsia"/>
           <w:b/>
           <w:sz w:val="22"/>
         </w:rPr>
-      </w:pPr>
-      <w:proofErr w:type="gramStart"/>
-      <w:r>
-        <w:rPr>
-          <w:rFonts w:eastAsia="돋움"/>
+        <w:t xml:space="preserve"> </w:t>
+      </w:r>
+      <w:r>
+        <w:rPr>
+          <w:rFonts w:eastAsia="돋움" w:hint="eastAsia"/>
           <w:b/>
           <w:sz w:val="22"/>
         </w:rPr>
-        <w:t xml:space="preserve">2.2 </w:t>
-      </w:r>
-      <w:r>
-        <w:rPr>
-          <w:rFonts w:eastAsia="돋움"/>
+        <w:t>및</w:t>
+      </w:r>
+      <w:r>
+        <w:rPr>
+          <w:rFonts w:eastAsia="돋움" w:hint="eastAsia"/>
           <w:b/>
           <w:sz w:val="22"/>
         </w:rPr>
@@ -1519,9 +1684,8 @@
           <w:b/>
           <w:sz w:val="22"/>
         </w:rPr>
-        <w:t>노란색</w:t>
-      </w:r>
-      <w:proofErr w:type="gramEnd"/>
+        <w:t>데이터</w:t>
+      </w:r>
       <w:r>
         <w:rPr>
           <w:rFonts w:eastAsia="돋움" w:hint="eastAsia"/>
@@ -1536,104 +1700,6 @@
           <w:b/>
           <w:sz w:val="22"/>
         </w:rPr>
-        <w:t>횡단보도</w:t>
-      </w:r>
-      <w:r>
-        <w:rPr>
-          <w:rFonts w:eastAsia="돋움" w:hint="eastAsia"/>
-          <w:b/>
-          <w:sz w:val="22"/>
-        </w:rPr>
-        <w:t xml:space="preserve"> </w:t>
-      </w:r>
-      <w:r>
-        <w:rPr>
-          <w:rFonts w:eastAsia="돋움" w:hint="eastAsia"/>
-          <w:b/>
-          <w:sz w:val="22"/>
-        </w:rPr>
-        <w:t>검출을</w:t>
-      </w:r>
-      <w:r>
-        <w:rPr>
-          <w:rFonts w:eastAsia="돋움" w:hint="eastAsia"/>
-          <w:b/>
-          <w:sz w:val="22"/>
-        </w:rPr>
-        <w:t xml:space="preserve"> </w:t>
-      </w:r>
-      <w:r>
-        <w:rPr>
-          <w:rFonts w:eastAsia="돋움" w:hint="eastAsia"/>
-          <w:b/>
-          <w:sz w:val="22"/>
-        </w:rPr>
-        <w:t>위한</w:t>
-      </w:r>
-      <w:r>
-        <w:rPr>
-          <w:rFonts w:eastAsia="돋움" w:hint="eastAsia"/>
-          <w:b/>
-          <w:sz w:val="22"/>
-        </w:rPr>
-        <w:t xml:space="preserve"> </w:t>
-      </w:r>
-      <w:proofErr w:type="spellStart"/>
-      <w:r>
-        <w:rPr>
-          <w:rFonts w:eastAsia="돋움" w:hint="eastAsia"/>
-          <w:b/>
-          <w:sz w:val="22"/>
-        </w:rPr>
-        <w:t>전처리</w:t>
-      </w:r>
-      <w:proofErr w:type="spellEnd"/>
-      <w:r>
-        <w:rPr>
-          <w:rFonts w:eastAsia="돋움" w:hint="eastAsia"/>
-          <w:b/>
-          <w:sz w:val="22"/>
-        </w:rPr>
-        <w:t xml:space="preserve"> </w:t>
-      </w:r>
-      <w:r>
-        <w:rPr>
-          <w:rFonts w:eastAsia="돋움" w:hint="eastAsia"/>
-          <w:b/>
-          <w:sz w:val="22"/>
-        </w:rPr>
-        <w:t>및</w:t>
-      </w:r>
-      <w:r>
-        <w:rPr>
-          <w:rFonts w:eastAsia="돋움" w:hint="eastAsia"/>
-          <w:b/>
-          <w:sz w:val="22"/>
-        </w:rPr>
-        <w:t xml:space="preserve"> </w:t>
-      </w:r>
-      <w:r>
-        <w:rPr>
-          <w:rFonts w:eastAsia="돋움" w:hint="eastAsia"/>
-          <w:b/>
-          <w:sz w:val="22"/>
-        </w:rPr>
-        <w:t>데이터</w:t>
-      </w:r>
-      <w:r>
-        <w:rPr>
-          <w:rFonts w:eastAsia="돋움" w:hint="eastAsia"/>
-          <w:b/>
-          <w:sz w:val="22"/>
-        </w:rPr>
-        <w:t xml:space="preserve"> </w:t>
-      </w:r>
-      <w:r>
-        <w:rPr>
-          <w:rFonts w:eastAsia="돋움" w:hint="eastAsia"/>
-          <w:b/>
-          <w:sz w:val="22"/>
-        </w:rPr>
         <w:t>확장</w:t>
       </w:r>
     </w:p>
@@ -1680,13 +1746,7 @@
         <w:rPr>
           <w:rFonts w:ascii="바탕" w:eastAsia="바탕" w:hAnsi="바탕" w:hint="eastAsia"/>
         </w:rPr>
-        <w:t xml:space="preserve">, </w:t>
-      </w:r>
-      <w:r>
-        <w:rPr>
-          <w:rFonts w:ascii="바탕" w:eastAsia="바탕" w:hAnsi="바탕" w:hint="eastAsia"/>
-        </w:rPr>
-        <w:t>horizontal flip</w:t>
+        <w:t>, horizontal flip</w:t>
       </w:r>
       <w:r>
         <w:rPr>
@@ -1758,7 +1818,7 @@
         <w:ind w:firstLine="278"/>
         <w:jc w:val="center"/>
         <w:rPr>
-          <w:rFonts w:ascii="바탕" w:eastAsia="바탕" w:hAnsi="바탕" w:hint="eastAsia"/>
+          <w:rFonts w:ascii="바탕" w:eastAsia="바탕" w:hAnsi="바탕"/>
         </w:rPr>
       </w:pPr>
       <m:oMath>
@@ -3972,81 +4032,73 @@
         </w:rPr>
         <w:t xml:space="preserve"> </w:t>
       </w:r>
+      <w:r>
+        <w:rPr>
+          <w:rFonts w:ascii="바탕체" w:hAnsi="바탕체" w:cs="바탕체" w:hint="eastAsia"/>
+        </w:rPr>
+        <w:t xml:space="preserve">사용한 데이터는 </w:t>
+      </w:r>
+      <w:r>
+        <w:rPr>
+          <w:rFonts w:ascii="바탕체" w:hAnsi="바탕체" w:cs="바탕체" w:hint="eastAsia"/>
+        </w:rPr>
+        <w:t>참고</w:t>
+      </w:r>
+      <w:r>
+        <w:rPr>
+          <w:rFonts w:ascii="바탕체" w:hAnsi="바탕체" w:cs="바탕체" w:hint="eastAsia"/>
+        </w:rPr>
+        <w:t>문헌</w:t>
+      </w:r>
+      <w:r>
+        <w:rPr>
+          <w:rFonts w:ascii="바탕체" w:hAnsi="바탕체" w:cs="바탕체" w:hint="eastAsia"/>
+        </w:rPr>
+        <w:t xml:space="preserve"> </w:t>
+      </w:r>
+      <w:r>
+        <w:rPr>
+          <w:rFonts w:ascii="바탕체" w:hAnsi="바탕체" w:cs="바탕체"/>
+        </w:rPr>
+        <w:t>[</w:t>
+      </w:r>
+      <w:r>
+        <w:rPr>
+          <w:rFonts w:ascii="바탕체" w:hAnsi="바탕체" w:cs="바탕체" w:hint="eastAsia"/>
+        </w:rPr>
+        <w:t>1</w:t>
+      </w:r>
       <w:proofErr w:type="gramStart"/>
       <w:r>
         <w:rPr>
+          <w:rFonts w:ascii="바탕체" w:hAnsi="바탕체" w:cs="바탕체"/>
+        </w:rPr>
+        <w:t xml:space="preserve">] </w:t>
+      </w:r>
+      <w:r>
+        <w:rPr>
           <w:rFonts w:ascii="바탕체" w:hAnsi="바탕체" w:cs="바탕체" w:hint="eastAsia"/>
         </w:rPr>
-        <w:t>사용한</w:t>
+        <w:t>에서</w:t>
       </w:r>
       <w:proofErr w:type="gramEnd"/>
       <w:r>
         <w:rPr>
           <w:rFonts w:ascii="바탕체" w:hAnsi="바탕체" w:cs="바탕체" w:hint="eastAsia"/>
         </w:rPr>
-        <w:t xml:space="preserve"> 데이터는 </w:t>
-      </w:r>
-      <w:r>
-        <w:rPr>
-          <w:rFonts w:ascii="바탕체" w:hAnsi="바탕체" w:cs="바탕체" w:hint="eastAsia"/>
-        </w:rPr>
-        <w:t>참고</w:t>
-      </w:r>
-      <w:r>
-        <w:rPr>
-          <w:rFonts w:ascii="바탕체" w:hAnsi="바탕체" w:cs="바탕체" w:hint="eastAsia"/>
-        </w:rPr>
-        <w:t>문헌</w:t>
-      </w:r>
-      <w:r>
-        <w:rPr>
-          <w:rFonts w:ascii="바탕체" w:hAnsi="바탕체" w:cs="바탕체" w:hint="eastAsia"/>
-        </w:rPr>
-        <w:t xml:space="preserve"> </w:t>
+        <w:t xml:space="preserve"> 공개한 데이터를 사용하였다.</w:t>
       </w:r>
       <w:r>
         <w:rPr>
           <w:rFonts w:ascii="바탕체" w:hAnsi="바탕체" w:cs="바탕체"/>
         </w:rPr>
-        <w:t>[</w:t>
-      </w:r>
-      <w:r>
-        <w:rPr>
-          <w:rFonts w:ascii="바탕체" w:hAnsi="바탕체" w:cs="바탕체" w:hint="eastAsia"/>
-        </w:rPr>
-        <w:t>1</w:t>
-      </w:r>
-      <w:proofErr w:type="gramStart"/>
-      <w:r>
-        <w:rPr>
-          <w:rFonts w:ascii="바탕체" w:hAnsi="바탕체" w:cs="바탕체"/>
-        </w:rPr>
-        <w:t xml:space="preserve">] </w:t>
-      </w:r>
-      <w:r>
-        <w:rPr>
-          <w:rFonts w:ascii="바탕체" w:hAnsi="바탕체" w:cs="바탕체" w:hint="eastAsia"/>
-        </w:rPr>
-        <w:t>에서</w:t>
-      </w:r>
-      <w:proofErr w:type="gramEnd"/>
-      <w:r>
-        <w:rPr>
-          <w:rFonts w:ascii="바탕체" w:hAnsi="바탕체" w:cs="바탕체" w:hint="eastAsia"/>
-        </w:rPr>
-        <w:t xml:space="preserve"> 공개한 데이터를 사용하였다.</w:t>
-      </w:r>
-      <w:r>
-        <w:rPr>
-          <w:rFonts w:ascii="바탕체" w:hAnsi="바탕체" w:cs="바탕체"/>
-        </w:rPr>
-        <w:t xml:space="preserve"> </w:t>
-      </w:r>
-    </w:p>
-    <w:p>
-      <w:pPr>
-        <w:rPr>
-          <w:rFonts w:ascii="바탕체" w:hAnsi="바탕체" w:hint="eastAsia"/>
+        <w:t xml:space="preserve"> </w:t>
+      </w:r>
+    </w:p>
+    <w:p>
+      <w:pPr>
+        <w:rPr>
+          <w:rFonts w:ascii="바탕체" w:hAnsi="바탕체"/>
         </w:rPr>
       </w:pPr>
     </w:p>
@@ -4069,7 +4121,7 @@
             <w:pPr>
               <w:jc w:val="center"/>
               <w:rPr>
-                <w:rFonts w:ascii="바탕체" w:hAnsi="바탕체" w:hint="eastAsia"/>
+                <w:rFonts w:ascii="바탕체" w:hAnsi="바탕체"/>
               </w:rPr>
             </w:pPr>
             <w:r>
@@ -4088,7 +4140,7 @@
             <w:pPr>
               <w:jc w:val="center"/>
               <w:rPr>
-                <w:rFonts w:ascii="바탕체" w:hAnsi="바탕체" w:hint="eastAsia"/>
+                <w:rFonts w:ascii="바탕체" w:hAnsi="바탕체"/>
               </w:rPr>
             </w:pPr>
             <w:r>
@@ -4109,7 +4161,7 @@
             <w:pPr>
               <w:jc w:val="center"/>
               <w:rPr>
-                <w:rFonts w:ascii="바탕체" w:hAnsi="바탕체" w:hint="eastAsia"/>
+                <w:rFonts w:ascii="바탕체" w:hAnsi="바탕체"/>
               </w:rPr>
             </w:pPr>
             <w:r>
@@ -4128,7 +4180,7 @@
             <w:pPr>
               <w:jc w:val="center"/>
               <w:rPr>
-                <w:rFonts w:ascii="바탕체" w:hAnsi="바탕체" w:hint="eastAsia"/>
+                <w:rFonts w:ascii="바탕체" w:hAnsi="바탕체"/>
               </w:rPr>
             </w:pPr>
             <w:r>
@@ -4149,7 +4201,7 @@
             <w:pPr>
               <w:jc w:val="center"/>
               <w:rPr>
-                <w:rFonts w:ascii="바탕체" w:hAnsi="바탕체" w:hint="eastAsia"/>
+                <w:rFonts w:ascii="바탕체" w:hAnsi="바탕체"/>
               </w:rPr>
             </w:pPr>
             <w:r>
@@ -4168,7 +4220,7 @@
             <w:pPr>
               <w:jc w:val="center"/>
               <w:rPr>
-                <w:rFonts w:ascii="바탕체" w:hAnsi="바탕체" w:hint="eastAsia"/>
+                <w:rFonts w:ascii="바탕체" w:hAnsi="바탕체"/>
               </w:rPr>
             </w:pPr>
             <w:r>
@@ -4189,7 +4241,7 @@
             <w:pPr>
               <w:jc w:val="center"/>
               <w:rPr>
-                <w:rFonts w:ascii="바탕체" w:hAnsi="바탕체" w:hint="eastAsia"/>
+                <w:rFonts w:ascii="바탕체" w:hAnsi="바탕체"/>
               </w:rPr>
             </w:pPr>
             <w:r>
@@ -4208,7 +4260,7 @@
             <w:pPr>
               <w:jc w:val="center"/>
               <w:rPr>
-                <w:rFonts w:ascii="바탕체" w:hAnsi="바탕체" w:hint="eastAsia"/>
+                <w:rFonts w:ascii="바탕체" w:hAnsi="바탕체"/>
               </w:rPr>
             </w:pPr>
             <w:r>
@@ -4229,7 +4281,7 @@
             <w:pPr>
               <w:jc w:val="center"/>
               <w:rPr>
-                <w:rFonts w:ascii="바탕체" w:hAnsi="바탕체" w:hint="eastAsia"/>
+                <w:rFonts w:ascii="바탕체" w:hAnsi="바탕체"/>
               </w:rPr>
             </w:pPr>
           </w:p>
@@ -4242,7 +4294,7 @@
             <w:pPr>
               <w:jc w:val="center"/>
               <w:rPr>
-                <w:rFonts w:ascii="바탕체" w:hAnsi="바탕체" w:hint="eastAsia"/>
+                <w:rFonts w:ascii="바탕체" w:hAnsi="바탕체"/>
               </w:rPr>
             </w:pPr>
           </w:p>
@@ -4257,7 +4309,7 @@
             <w:pPr>
               <w:jc w:val="center"/>
               <w:rPr>
-                <w:rFonts w:ascii="바탕체" w:hAnsi="바탕체" w:hint="eastAsia"/>
+                <w:rFonts w:ascii="바탕체" w:hAnsi="바탕체"/>
               </w:rPr>
             </w:pPr>
             <w:r>
@@ -4276,7 +4328,7 @@
             <w:pPr>
               <w:jc w:val="center"/>
               <w:rPr>
-                <w:rFonts w:ascii="바탕체" w:hAnsi="바탕체" w:hint="eastAsia"/>
+                <w:rFonts w:ascii="바탕체" w:hAnsi="바탕체"/>
               </w:rPr>
             </w:pPr>
             <w:r>
@@ -4297,7 +4349,7 @@
             <w:pPr>
               <w:jc w:val="center"/>
               <w:rPr>
-                <w:rFonts w:ascii="바탕체" w:hAnsi="바탕체" w:hint="eastAsia"/>
+                <w:rFonts w:ascii="바탕체" w:hAnsi="바탕체"/>
               </w:rPr>
             </w:pPr>
             <w:proofErr w:type="spellStart"/>
@@ -4324,7 +4376,7 @@
             <w:pPr>
               <w:jc w:val="center"/>
               <w:rPr>
-                <w:rFonts w:ascii="바탕체" w:hAnsi="바탕체" w:hint="eastAsia"/>
+                <w:rFonts w:ascii="바탕체" w:hAnsi="바탕체"/>
               </w:rPr>
             </w:pPr>
             <w:r>
@@ -4345,7 +4397,7 @@
             <w:pPr>
               <w:jc w:val="center"/>
               <w:rPr>
-                <w:rFonts w:ascii="바탕체" w:hAnsi="바탕체" w:hint="eastAsia"/>
+                <w:rFonts w:ascii="바탕체" w:hAnsi="바탕체"/>
               </w:rPr>
             </w:pPr>
             <w:proofErr w:type="spellStart"/>
@@ -4366,7 +4418,7 @@
             <w:pPr>
               <w:jc w:val="center"/>
               <w:rPr>
-                <w:rFonts w:ascii="바탕체" w:hAnsi="바탕체" w:hint="eastAsia"/>
+                <w:rFonts w:ascii="바탕체" w:hAnsi="바탕체"/>
               </w:rPr>
             </w:pPr>
             <w:r>
@@ -4383,20 +4435,20 @@
       <w:pPr>
         <w:jc w:val="center"/>
         <w:rPr>
+          <w:rFonts w:ascii="바탕체" w:hAnsi="바탕체"/>
+        </w:rPr>
+      </w:pPr>
+      <w:r>
+        <w:rPr>
           <w:rFonts w:ascii="바탕체" w:hAnsi="바탕체" w:hint="eastAsia"/>
         </w:rPr>
-      </w:pPr>
-      <w:r>
-        <w:rPr>
-          <w:rFonts w:ascii="바탕체" w:hAnsi="바탕체" w:hint="eastAsia"/>
-        </w:rPr>
         <w:t>학습 환경</w:t>
       </w:r>
     </w:p>
     <w:p>
       <w:pPr>
         <w:rPr>
-          <w:rFonts w:eastAsia="문체부 바탕체" w:hint="eastAsia"/>
+          <w:rFonts w:eastAsia="문체부 바탕체"/>
         </w:rPr>
       </w:pPr>
     </w:p>
@@ -5684,6 +5736,7 @@
               <w:rPr>
                 <w:rFonts w:hint="eastAsia"/>
               </w:rPr>
+              <w:lastRenderedPageBreak/>
               <w:t>A</w:t>
             </w:r>
           </w:p>
@@ -6184,21 +6237,7 @@
             <w:rStyle w:val="a9"/>
             <w:rFonts w:ascii="바탕" w:eastAsia="바탕" w:hAnsi="바탕"/>
           </w:rPr>
-          <w:t>https://github.com/kair</w:t>
-        </w:r>
-        <w:r>
-          <w:rPr>
-            <w:rStyle w:val="a9"/>
-            <w:rFonts w:ascii="바탕" w:eastAsia="바탕" w:hAnsi="바탕"/>
-          </w:rPr>
-          <w:t>e</w:t>
-        </w:r>
-        <w:r>
-          <w:rPr>
-            <w:rStyle w:val="a9"/>
-            <w:rFonts w:ascii="바탕" w:eastAsia="바탕" w:hAnsi="바탕"/>
-          </w:rPr>
-          <w:t>ss/crosswalk-traffic-light-detection-yolov5</w:t>
+          <w:t>https://github.com/kairess/crosswalk-traffic-light-detection-yolov5</w:t>
         </w:r>
       </w:hyperlink>
     </w:p>

</xml_diff>